<commit_message>
Add Kualifikimi to the employee profile and to Neni 2 of contracts
Employees now carry a qualification (schooling / professional training), the
element Neni 11.1.3 of the Labour Law requires a contract to state. It is
editable next to Vendi i punës, shown on the profile, and printed in Neni 2 of
both standard contracts and of the praktikant template.

Adding a blank to Neni 2 shifts every later blank by one, so the manifest and
the detection hints move with it: workplace is now field 8 rather than 7.

emptyToNull also treats a whitespace-only entry as empty, so a field filled
with spaces stores null instead of "" — the same wart existed for the other
optional text fields.

Co-Authored-By: Claude Fable 5 <noreply@anthropic.com>
</commit_message>
<xml_diff>
--- a/templates/contracts/kontrate-me-afat-te-caktuar.docx
+++ b/templates/contracts/kontrate-me-afat-te-caktuar.docx
@@ -194,6 +194,29 @@
           <w:sz w:val="18"/>
         </w:rPr>
         <w:t>( emërtimi, natyra, lloji i punës dhe përshkrimi i detyrave të punës).</w:t>
+      </w:r>
+    </w:p>
+    <w:p>
+      <w:pPr>
+        <w:pStyle w:val="BodyLegal"/>
+        <w:jc w:val="both"/>
+      </w:pPr>
+      <w:r>
+        <w:t xml:space="preserve">Kualifikimi i të punësuarit: _______________________________</w:t>
+      </w:r>
+    </w:p>
+    <w:p>
+      <w:pPr>
+        <w:pStyle w:val="BodyLegal"/>
+        <w:jc w:val="both"/>
+      </w:pPr>
+      <w:r>
+        <w:rPr>
+          <w:i/>
+          <w:color w:val="555555"/>
+          <w:sz w:val="18"/>
+        </w:rPr>
+        <w:t xml:space="preserve">(shkalla e shkollimit dhe përgatitja profesionale e të punësuarit).</w:t>
       </w:r>
     </w:p>
     <w:p>

</xml_diff>